<commit_message>
Replace old files with updated versions
</commit_message>
<xml_diff>
--- a/etik kurul başvurları/DANIŞMAN UYGUNLUK YAZISI (ÖLÇME ARAÇLARI İÇİN).docx
+++ b/etik kurul başvurları/DANIŞMAN UYGUNLUK YAZISI (ÖLÇME ARAÇLARI İÇİN).docx
@@ -8,7 +8,6 @@
         <w:jc w:val="right"/>
         <w:rPr>
           <w:rFonts w:ascii="Times New Roman" w:eastAsia="Times New Roman" w:hAnsi="Times New Roman"/>
-          <w:b/>
           <w:sz w:val="24"/>
           <w:szCs w:val="24"/>
           <w:lang w:eastAsia="tr-TR"/>
@@ -30,7 +29,52 @@
           <w:szCs w:val="24"/>
           <w:lang w:eastAsia="tr-TR"/>
         </w:rPr>
-        <w:t>1</w:t>
+        <w:t>06</w:t>
+      </w:r>
+      <w:r>
+        <w:rPr>
+          <w:rFonts w:ascii="Times New Roman" w:eastAsia="Times New Roman" w:hAnsi="Times New Roman"/>
+          <w:sz w:val="24"/>
+          <w:szCs w:val="24"/>
+          <w:lang w:eastAsia="tr-TR"/>
+        </w:rPr>
+        <w:t>/</w:t>
+      </w:r>
+      <w:r>
+        <w:rPr>
+          <w:rFonts w:ascii="Times New Roman" w:eastAsia="Times New Roman" w:hAnsi="Times New Roman"/>
+          <w:sz w:val="24"/>
+          <w:szCs w:val="24"/>
+          <w:lang w:eastAsia="tr-TR"/>
+        </w:rPr>
+        <w:t>04</w:t>
+      </w:r>
+      <w:r>
+        <w:rPr>
+          <w:rFonts w:ascii="Times New Roman" w:eastAsia="Times New Roman" w:hAnsi="Times New Roman"/>
+          <w:sz w:val="24"/>
+          <w:szCs w:val="24"/>
+          <w:lang w:eastAsia="tr-TR"/>
+        </w:rPr>
+        <w:t>/</w:t>
+      </w:r>
+      <w:r>
+        <w:rPr>
+          <w:rFonts w:ascii="Times New Roman" w:eastAsia="Times New Roman" w:hAnsi="Times New Roman"/>
+          <w:sz w:val="24"/>
+          <w:szCs w:val="24"/>
+          <w:lang w:eastAsia="tr-TR"/>
+        </w:rPr>
+        <w:t>20</w:t>
+      </w:r>
+      <w:r>
+        <w:rPr>
+          <w:rFonts w:ascii="Times New Roman" w:eastAsia="Times New Roman" w:hAnsi="Times New Roman"/>
+          <w:sz w:val="24"/>
+          <w:szCs w:val="24"/>
+          <w:lang w:eastAsia="tr-TR"/>
+        </w:rPr>
+        <w:t>2</w:t>
       </w:r>
       <w:r>
         <w:rPr>
@@ -40,60 +84,6 @@
           <w:lang w:eastAsia="tr-TR"/>
         </w:rPr>
         <w:t>6</w:t>
-      </w:r>
-      <w:r>
-        <w:rPr>
-          <w:rFonts w:ascii="Times New Roman" w:eastAsia="Times New Roman" w:hAnsi="Times New Roman"/>
-          <w:sz w:val="24"/>
-          <w:szCs w:val="24"/>
-          <w:lang w:eastAsia="tr-TR"/>
-        </w:rPr>
-        <w:t>/</w:t>
-      </w:r>
-      <w:r>
-        <w:rPr>
-          <w:rFonts w:ascii="Times New Roman" w:eastAsia="Times New Roman" w:hAnsi="Times New Roman"/>
-          <w:sz w:val="24"/>
-          <w:szCs w:val="24"/>
-          <w:lang w:eastAsia="tr-TR"/>
-        </w:rPr>
-        <w:t>12</w:t>
-      </w:r>
-      <w:r>
-        <w:rPr>
-          <w:rFonts w:ascii="Times New Roman" w:eastAsia="Times New Roman" w:hAnsi="Times New Roman"/>
-          <w:sz w:val="24"/>
-          <w:szCs w:val="24"/>
-          <w:lang w:eastAsia="tr-TR"/>
-        </w:rPr>
-        <w:t>/</w:t>
-      </w:r>
-      <w:r>
-        <w:rPr>
-          <w:rFonts w:ascii="Times New Roman" w:eastAsia="Times New Roman" w:hAnsi="Times New Roman"/>
-          <w:sz w:val="24"/>
-          <w:szCs w:val="24"/>
-          <w:lang w:eastAsia="tr-TR"/>
-        </w:rPr>
-        <w:t>20</w:t>
-      </w:r>
-      <w:r>
-        <w:rPr>
-          <w:rFonts w:ascii="Times New Roman" w:eastAsia="Times New Roman" w:hAnsi="Times New Roman"/>
-          <w:sz w:val="24"/>
-          <w:szCs w:val="24"/>
-          <w:lang w:eastAsia="tr-TR"/>
-        </w:rPr>
-        <w:t>2</w:t>
-      </w:r>
-      <w:r>
-        <w:rPr>
-          <w:rFonts w:ascii="Times New Roman" w:eastAsia="Times New Roman" w:hAnsi="Times New Roman"/>
-          <w:sz w:val="24"/>
-          <w:szCs w:val="24"/>
-          <w:lang w:eastAsia="tr-TR"/>
-        </w:rPr>
-        <w:t>5</w:t>
       </w:r>
     </w:p>
     <w:p>
@@ -204,7 +194,27 @@
           <w:szCs w:val="24"/>
           <w:lang w:eastAsia="tr-TR"/>
         </w:rPr>
-        <w:t>Etik Kurul Başvurusu Ölçme Araçları Uygunluğu Hk.</w:t>
+        <w:t xml:space="preserve">Etik Kurul Başvurusu Ölçme Araçları Uygunluğu </w:t>
+      </w:r>
+      <w:proofErr w:type="spellStart"/>
+      <w:r>
+        <w:rPr>
+          <w:rFonts w:ascii="Times New Roman" w:eastAsia="Times New Roman" w:hAnsi="Times New Roman"/>
+          <w:sz w:val="24"/>
+          <w:szCs w:val="24"/>
+          <w:lang w:eastAsia="tr-TR"/>
+        </w:rPr>
+        <w:t>Hk</w:t>
+      </w:r>
+      <w:proofErr w:type="spellEnd"/>
+      <w:r>
+        <w:rPr>
+          <w:rFonts w:ascii="Times New Roman" w:eastAsia="Times New Roman" w:hAnsi="Times New Roman"/>
+          <w:sz w:val="24"/>
+          <w:szCs w:val="24"/>
+          <w:lang w:eastAsia="tr-TR"/>
+        </w:rPr>
+        <w:t>.</w:t>
       </w:r>
     </w:p>
     <w:p>
@@ -238,7 +248,73 @@
           <w:szCs w:val="24"/>
           <w:lang w:eastAsia="tr-TR"/>
         </w:rPr>
-        <w:t>Yürütücülüğünü yapmakta olduğum, "PCOS’lu Üniversite Öğrencilerinin Akademik Verimlilik Analizi için Yapay Zekâ Destekli Akıllı Takip Uygulaması" başlıklı projede, araştırmacı öğrenci Sedra AL OUDAT ALLAH ile birlikte mobil uygulama üzerinden kullanılacak olan tüm ölçme araçları (anket maddeleri ve ölçekler) tarafımızca incelenmiş ve onaylanmıştır. Proje kapsamında kullanılacak olan temel ölçme araçları ve veri girişleri şunlardır: 1. Günlük Akademik Verimlilik Puanı (1-10 Likert Tipi Derecelendirme) 2. Kullanıcı Girişleri: Uyku süresi, çalışma süresi, ruh hâli, stres düzeyi, yorgunluk, odaklanma, beslenme düzeni ve fiziksel aktivite süresi. 3. Telefon Sensör Verileri (Anonimleştirilmiş): Fiziksel aktivite verileri (adım sayısı gibi) ve ekran kullanım süresi. Bu ölçme araçlarının projenin amaçlarına ve bilimsel yöntemine uygun olduğunu, gönüllü katılımcıların etik haklarını ihlal etmediğini ve Etik Kurul’a sunulan EK 4 özet dosyasında yer aldığını beyan ederim. Ölçme araçlarının (mobil uygulama içeriği) her sayfasının fiziksel olarak paraflanmasının mümkün olmadığı durumlarda, bu yazı, Proje Yürütücüsü olarak tarafımdan söz konusu ölçme araçlarının kullanılmasına yönelik uygunluk ve onay yazısı yerine geçecektir.</w:t>
+        <w:t>Yürütücülüğünü yapmakta olduğum, "</w:t>
+      </w:r>
+      <w:proofErr w:type="spellStart"/>
+      <w:r>
+        <w:rPr>
+          <w:rFonts w:ascii="Times New Roman" w:eastAsia="Times New Roman" w:hAnsi="Times New Roman"/>
+          <w:sz w:val="24"/>
+          <w:szCs w:val="24"/>
+          <w:lang w:eastAsia="tr-TR"/>
+        </w:rPr>
+        <w:t>PCOS’lu</w:t>
+      </w:r>
+      <w:proofErr w:type="spellEnd"/>
+      <w:r>
+        <w:rPr>
+          <w:rFonts w:ascii="Times New Roman" w:eastAsia="Times New Roman" w:hAnsi="Times New Roman"/>
+          <w:sz w:val="24"/>
+          <w:szCs w:val="24"/>
+          <w:lang w:eastAsia="tr-TR"/>
+        </w:rPr>
+        <w:t xml:space="preserve"> Üniversite Öğrencilerinin Akademik Verimlilik Analizi için Yapay Zekâ Destekli Akıllı Takip Uygulaması" başlıklı projede, araştırmacı öğrenci Sedra AL OUDAT ALLAH ile birlikte mobil uygulama üzerinden kullanılacak olan tüm ölçme araçları (anket maddeleri ve ölçekler) tarafımızca incelenmiş ve onaylanmıştır. Proje kapsamında kullanılacak olan temel ölçme araçları ve veri girişleri şunlardır: 1. Günlük Akademik Verimlilik Puanı (1-10 </w:t>
+      </w:r>
+      <w:proofErr w:type="spellStart"/>
+      <w:r>
+        <w:rPr>
+          <w:rFonts w:ascii="Times New Roman" w:eastAsia="Times New Roman" w:hAnsi="Times New Roman"/>
+          <w:sz w:val="24"/>
+          <w:szCs w:val="24"/>
+          <w:lang w:eastAsia="tr-TR"/>
+        </w:rPr>
+        <w:t>Likert</w:t>
+      </w:r>
+      <w:proofErr w:type="spellEnd"/>
+      <w:r>
+        <w:rPr>
+          <w:rFonts w:ascii="Times New Roman" w:eastAsia="Times New Roman" w:hAnsi="Times New Roman"/>
+          <w:sz w:val="24"/>
+          <w:szCs w:val="24"/>
+          <w:lang w:eastAsia="tr-TR"/>
+        </w:rPr>
+        <w:t xml:space="preserve"> Tipi Derecelendirme) 2. Kullanıcı Girişleri: Uyku süresi, çalışma süresi, ruh hâli, stres düzeyi, yorgunluk, odaklanma, beslenme düzeni ve fiziksel aktivite süresi. 3. </w:t>
+      </w:r>
+      <w:r>
+        <w:rPr>
+          <w:rFonts w:asciiTheme="majorBidi" w:hAnsiTheme="majorBidi" w:cstheme="majorBidi"/>
+          <w:sz w:val="24"/>
+          <w:szCs w:val="24"/>
+        </w:rPr>
+        <w:t>Telefon Sensör Verileri (Katılımcı açık rızası ile alınan, kodlanmış araştırma verileri)</w:t>
+      </w:r>
+      <w:r>
+        <w:rPr>
+          <w:rFonts w:asciiTheme="majorBidi" w:eastAsia="Times New Roman" w:hAnsiTheme="majorBidi" w:cstheme="majorBidi"/>
+          <w:sz w:val="24"/>
+          <w:szCs w:val="24"/>
+          <w:lang w:eastAsia="tr-TR"/>
+        </w:rPr>
+        <w:t xml:space="preserve">: </w:t>
+      </w:r>
+      <w:r>
+        <w:rPr>
+          <w:rFonts w:ascii="Times New Roman" w:eastAsia="Times New Roman" w:hAnsi="Times New Roman"/>
+          <w:sz w:val="24"/>
+          <w:szCs w:val="24"/>
+          <w:lang w:eastAsia="tr-TR"/>
+        </w:rPr>
+        <w:t>Fiziksel aktivite verileri (adım sayısı gibi) ve ekran kullanım süresi. Bu ölçme araçlarının projenin amaçlarına ve bilimsel yöntemine uygun olduğunu, gönüllü katılımcıların etik haklarını ihlal etmediğini ve Etik Kurul’a sunulan EK 4 özet dosyasında yer aldığını beyan ederim. Ölçme araçlarının (mobil uygulama içeriği) her sayfasının fiziksel olarak paraflanmasının mümkün olmadığı durumlarda, bu yazı, Proje Yürütücüsü olarak tarafımdan söz konusu ölçme araçlarının kullanılmasına yönelik uygunluk ve onay yazısı yerine geçecektir.</w:t>
       </w:r>
     </w:p>
     <w:p>
@@ -779,6 +855,7 @@
               <w:lang w:val="en-AU"/>
             </w:rPr>
           </w:pPr>
+          <w:proofErr w:type="spellStart"/>
           <w:r>
             <w:rPr>
               <w:rFonts w:ascii="Times New Roman" w:eastAsia="Times New Roman" w:hAnsi="Times New Roman"/>
@@ -787,7 +864,18 @@
               <w:szCs w:val="24"/>
               <w:lang w:val="en-AU"/>
             </w:rPr>
-            <w:t>Doküman No</w:t>
+            <w:t>Doküman</w:t>
+          </w:r>
+          <w:proofErr w:type="spellEnd"/>
+          <w:r>
+            <w:rPr>
+              <w:rFonts w:ascii="Times New Roman" w:eastAsia="Times New Roman" w:hAnsi="Times New Roman"/>
+              <w:b/>
+              <w:sz w:val="18"/>
+              <w:szCs w:val="24"/>
+              <w:lang w:val="en-AU"/>
+            </w:rPr>
+            <w:t xml:space="preserve"> No</w:t>
           </w:r>
         </w:p>
       </w:tc>
@@ -1825,6 +1913,7 @@
   <w:style w:type="character" w:default="1" w:styleId="DefaultParagraphFont">
     <w:name w:val="Default Paragraph Font"/>
     <w:uiPriority w:val="1"/>
+    <w:semiHidden/>
     <w:unhideWhenUsed/>
   </w:style>
   <w:style w:type="table" w:default="1" w:styleId="TableNormal">

</xml_diff>